<commit_message>
feat(demos): nest smart fields inside Permitted Use clause and sharpen export status (SD-3130)
Refreshes the fixture so 'Receiving party' and 'Purpose' each appear twice: once in the header sentence and once nested inside the Permitted Use block clause. Demonstrates selectByTag fan-out across the document including inside managed clauses, which is the contract-template behavior the customer reference shows.

Permitted Use is in the no-upgrade set, so the nested fields never collide with replaceContent (which would otherwise flatten the inner SDTs). The upgradeable clauses (Confidentiality, Governing Law, Limitation of Liability) stay field-free.

Also sharpens the export status from 'Exported' to 'Exported Mutual NDA.docx' so the workflow finish is concrete.

Verified: fixture loads with 13 SDTs (was 11), receivingParty and purpose return 2 occurrences each via selectByTag, editing one input + Apply updates both occurrences, export status reads 'Exported Mutual NDA.docx'.
</commit_message>
<xml_diff>
--- a/demos/contract-templates/public/nda-template.docx
+++ b/demos/contract-templates/public/nda-template.docx
@@ -18,7 +18,7 @@
         <w:sdtPr>
           <w:alias w:val="Disclosing party"/>
           <w:tag w:val="{&quot;kind&quot;:&quot;smartField&quot;,&quot;key&quot;:&quot;disclosingParty&quot;}"/>
-          <w:id w:val="-965280675"/>
+          <w:id w:val="-1736319433"/>
           <w:placeholder>
             <w:docPart w:val="DefaultPlaceholder_-1854013440"/>
           </w:placeholder>
@@ -36,7 +36,7 @@
         <w:sdtPr>
           <w:alias w:val="Receiving party"/>
           <w:tag w:val="{&quot;kind&quot;:&quot;smartField&quot;,&quot;key&quot;:&quot;receivingParty&quot;}"/>
-          <w:id w:val="1072631922"/>
+          <w:id w:val="-1068260375"/>
           <w:placeholder>
             <w:docPart w:val="DefaultPlaceholder_-1854013440"/>
           </w:placeholder>
@@ -54,7 +54,7 @@
         <w:sdtPr>
           <w:alias w:val="Effective date"/>
           <w:tag w:val="{&quot;kind&quot;:&quot;smartField&quot;,&quot;key&quot;:&quot;effectiveDate&quot;}"/>
-          <w:id w:val="901635992"/>
+          <w:id w:val="1512262509"/>
           <w:placeholder>
             <w:docPart w:val="DefaultPlaceholder_-1854013440"/>
           </w:placeholder>
@@ -72,7 +72,7 @@
         <w:sdtPr>
           <w:alias w:val="Purpose"/>
           <w:tag w:val="{&quot;kind&quot;:&quot;smartField&quot;,&quot;key&quot;:&quot;purpose&quot;}"/>
-          <w:id w:val="779305199"/>
+          <w:id w:val="-948689326"/>
           <w:placeholder>
             <w:docPart w:val="DefaultPlaceholder_-1854013440"/>
           </w:placeholder>
@@ -90,7 +90,7 @@
         <w:sdtPr>
           <w:alias w:val="Term"/>
           <w:tag w:val="{&quot;kind&quot;:&quot;smartField&quot;,&quot;key&quot;:&quot;termLength&quot;}"/>
-          <w:id w:val="558819850"/>
+          <w:id w:val="-112512914"/>
           <w:placeholder>
             <w:docPart w:val="DefaultPlaceholder_-1854013440"/>
           </w:placeholder>
@@ -109,7 +109,7 @@
       <w:sdtPr>
         <w:alias w:val="Preamble (v1)"/>
         <w:tag w:val="{&quot;kind&quot;:&quot;reusableSection&quot;,&quot;sectionId&quot;:&quot;preamble&quot;,&quot;version&quot;:&quot;v1&quot;}"/>
-        <w:id w:val="2084180543"/>
+        <w:id w:val="1714162087"/>
         <w:placeholder>
           <w:docPart w:val="DefaultPlaceholder_-1854013440"/>
         </w:placeholder>
@@ -126,7 +126,7 @@
       <w:sdtPr>
         <w:alias w:val="Confidentiality Obligations (v1)"/>
         <w:tag w:val="{&quot;kind&quot;:&quot;reusableSection&quot;,&quot;sectionId&quot;:&quot;confidentiality&quot;,&quot;version&quot;:&quot;v1&quot;}"/>
-        <w:id w:val="-1221125618"/>
+        <w:id w:val="-1626530754"/>
         <w:placeholder>
           <w:docPart w:val="DefaultPlaceholder_-1854013440"/>
         </w:placeholder>
@@ -143,15 +143,48 @@
       <w:sdtPr>
         <w:alias w:val="Permitted Use (v1)"/>
         <w:tag w:val="{&quot;kind&quot;:&quot;reusableSection&quot;,&quot;sectionId&quot;:&quot;permittedUse&quot;,&quot;version&quot;:&quot;v1&quot;}"/>
-        <w:id w:val="1634365463"/>
+        <w:id w:val="766278594"/>
         <w:placeholder>
           <w:docPart w:val="DefaultPlaceholder_-1854013440"/>
         </w:placeholder>
       </w:sdtPr>
       <w:sdtContent>
         <w:p>
+          <w:sdt>
+            <w:sdtPr>
+              <w:alias w:val="Receiving party"/>
+              <w:tag w:val="{&quot;kind&quot;:&quot;smartField&quot;,&quot;key&quot;:&quot;receivingParty&quot;}"/>
+              <w:id w:val="489068937"/>
+              <w:placeholder>
+                <w:docPart w:val="DefaultPlaceholder_-1854013440"/>
+              </w:placeholder>
+            </w:sdtPr>
+            <w:sdtContent>
+              <w:r>
+                <w:t>Beacon Bio</w:t>
+              </w:r>
+            </w:sdtContent>
+          </w:sdt>
           <w:r>
-            <w:t>The Receiving Party may use Confidential Information solely for the stated purpose and for no other purpose, and will limit access to its employees and advisors with a need to know.</w:t>
+            <w:t xml:space="preserve"> may use Confidential Information solely for </w:t>
+          </w:r>
+          <w:sdt>
+            <w:sdtPr>
+              <w:alias w:val="Purpose"/>
+              <w:tag w:val="{&quot;kind&quot;:&quot;smartField&quot;,&quot;key&quot;:&quot;purpose&quot;}"/>
+              <w:id w:val="-332537422"/>
+              <w:placeholder>
+                <w:docPart w:val="DefaultPlaceholder_-1854013440"/>
+              </w:placeholder>
+            </w:sdtPr>
+            <w:sdtContent>
+              <w:r>
+                <w:t>evaluating a potential collaboration</w:t>
+              </w:r>
+            </w:sdtContent>
+          </w:sdt>
+          <w:r>
+            <w:t xml:space="preserve"> and for no other purpose, and will limit access to its employees and advisors with a need to know.</w:t>
           </w:r>
         </w:p>
       </w:sdtContent>
@@ -160,7 +193,7 @@
       <w:sdtPr>
         <w:alias w:val="Term and Termination (v1)"/>
         <w:tag w:val="{&quot;kind&quot;:&quot;reusableSection&quot;,&quot;sectionId&quot;:&quot;termination&quot;,&quot;version&quot;:&quot;v1&quot;}"/>
-        <w:id w:val="-1617362590"/>
+        <w:id w:val="427852654"/>
         <w:placeholder>
           <w:docPart w:val="DefaultPlaceholder_-1854013440"/>
         </w:placeholder>
@@ -177,7 +210,7 @@
       <w:sdtPr>
         <w:alias w:val="Governing Law (v1)"/>
         <w:tag w:val="{&quot;kind&quot;:&quot;reusableSection&quot;,&quot;sectionId&quot;:&quot;governingLaw&quot;,&quot;version&quot;:&quot;v1&quot;}"/>
-        <w:id w:val="-349573680"/>
+        <w:id w:val="689416510"/>
         <w:placeholder>
           <w:docPart w:val="DefaultPlaceholder_-1854013440"/>
         </w:placeholder>
@@ -194,7 +227,7 @@
       <w:sdtPr>
         <w:alias w:val="Limitation of Liability (v1)"/>
         <w:tag w:val="{&quot;kind&quot;:&quot;reusableSection&quot;,&quot;sectionId&quot;:&quot;limitationOfLiability&quot;,&quot;version&quot;:&quot;v1&quot;}"/>
-        <w:id w:val="-875239403"/>
+        <w:id w:val="69707720"/>
         <w:placeholder>
           <w:docPart w:val="DefaultPlaceholder_-1854013440"/>
         </w:placeholder>
@@ -626,7 +659,7 @@
     <w:link w:val="Heading1Char"/>
     <w:uiPriority w:val="9"/>
     <w:qFormat/>
-    <w:rsid w:val="00FA0656"/>
+    <w:rsid w:val="009E6A7F"/>
     <w:pPr>
       <w:keepNext/>
       <w:keepLines/>
@@ -649,7 +682,7 @@
     <w:semiHidden/>
     <w:unhideWhenUsed/>
     <w:qFormat/>
-    <w:rsid w:val="00FA0656"/>
+    <w:rsid w:val="009E6A7F"/>
     <w:pPr>
       <w:keepNext/>
       <w:keepLines/>
@@ -672,7 +705,7 @@
     <w:semiHidden/>
     <w:unhideWhenUsed/>
     <w:qFormat/>
-    <w:rsid w:val="00FA0656"/>
+    <w:rsid w:val="009E6A7F"/>
     <w:pPr>
       <w:keepNext/>
       <w:keepLines/>
@@ -695,7 +728,7 @@
     <w:semiHidden/>
     <w:unhideWhenUsed/>
     <w:qFormat/>
-    <w:rsid w:val="00FA0656"/>
+    <w:rsid w:val="009E6A7F"/>
     <w:pPr>
       <w:keepNext/>
       <w:keepLines/>
@@ -718,7 +751,7 @@
     <w:semiHidden/>
     <w:unhideWhenUsed/>
     <w:qFormat/>
-    <w:rsid w:val="00FA0656"/>
+    <w:rsid w:val="009E6A7F"/>
     <w:pPr>
       <w:keepNext/>
       <w:keepLines/>
@@ -739,7 +772,7 @@
     <w:semiHidden/>
     <w:unhideWhenUsed/>
     <w:qFormat/>
-    <w:rsid w:val="00FA0656"/>
+    <w:rsid w:val="009E6A7F"/>
     <w:pPr>
       <w:keepNext/>
       <w:keepLines/>
@@ -762,7 +795,7 @@
     <w:semiHidden/>
     <w:unhideWhenUsed/>
     <w:qFormat/>
-    <w:rsid w:val="00FA0656"/>
+    <w:rsid w:val="009E6A7F"/>
     <w:pPr>
       <w:keepNext/>
       <w:keepLines/>
@@ -783,7 +816,7 @@
     <w:semiHidden/>
     <w:unhideWhenUsed/>
     <w:qFormat/>
-    <w:rsid w:val="00FA0656"/>
+    <w:rsid w:val="009E6A7F"/>
     <w:pPr>
       <w:keepNext/>
       <w:keepLines/>
@@ -806,7 +839,7 @@
     <w:semiHidden/>
     <w:unhideWhenUsed/>
     <w:qFormat/>
-    <w:rsid w:val="00FA0656"/>
+    <w:rsid w:val="009E6A7F"/>
     <w:pPr>
       <w:keepNext/>
       <w:keepLines/>
@@ -850,7 +883,7 @@
     <w:basedOn w:val="DefaultParagraphFont"/>
     <w:link w:val="Heading1"/>
     <w:uiPriority w:val="9"/>
-    <w:rsid w:val="00FA0656"/>
+    <w:rsid w:val="009E6A7F"/>
     <w:rPr>
       <w:rFonts w:asciiTheme="majorHAnsi" w:eastAsiaTheme="majorEastAsia" w:hAnsiTheme="majorHAnsi" w:cstheme="majorBidi"/>
       <w:color w:val="0F4761" w:themeColor="accent1" w:themeShade="BF"/>
@@ -864,7 +897,7 @@
     <w:link w:val="Heading2"/>
     <w:uiPriority w:val="9"/>
     <w:semiHidden/>
-    <w:rsid w:val="00FA0656"/>
+    <w:rsid w:val="009E6A7F"/>
     <w:rPr>
       <w:rFonts w:asciiTheme="majorHAnsi" w:eastAsiaTheme="majorEastAsia" w:hAnsiTheme="majorHAnsi" w:cstheme="majorBidi"/>
       <w:color w:val="0F4761" w:themeColor="accent1" w:themeShade="BF"/>
@@ -878,7 +911,7 @@
     <w:link w:val="Heading3"/>
     <w:uiPriority w:val="9"/>
     <w:semiHidden/>
-    <w:rsid w:val="00FA0656"/>
+    <w:rsid w:val="009E6A7F"/>
     <w:rPr>
       <w:rFonts w:eastAsiaTheme="majorEastAsia" w:cstheme="majorBidi"/>
       <w:color w:val="0F4761" w:themeColor="accent1" w:themeShade="BF"/>
@@ -892,7 +925,7 @@
     <w:link w:val="Heading4"/>
     <w:uiPriority w:val="9"/>
     <w:semiHidden/>
-    <w:rsid w:val="00FA0656"/>
+    <w:rsid w:val="009E6A7F"/>
     <w:rPr>
       <w:rFonts w:eastAsiaTheme="majorEastAsia" w:cstheme="majorBidi"/>
       <w:i/>
@@ -906,7 +939,7 @@
     <w:link w:val="Heading5"/>
     <w:uiPriority w:val="9"/>
     <w:semiHidden/>
-    <w:rsid w:val="00FA0656"/>
+    <w:rsid w:val="009E6A7F"/>
     <w:rPr>
       <w:rFonts w:eastAsiaTheme="majorEastAsia" w:cstheme="majorBidi"/>
       <w:color w:val="0F4761" w:themeColor="accent1" w:themeShade="BF"/>
@@ -918,7 +951,7 @@
     <w:link w:val="Heading6"/>
     <w:uiPriority w:val="9"/>
     <w:semiHidden/>
-    <w:rsid w:val="00FA0656"/>
+    <w:rsid w:val="009E6A7F"/>
     <w:rPr>
       <w:rFonts w:eastAsiaTheme="majorEastAsia" w:cstheme="majorBidi"/>
       <w:i/>
@@ -932,7 +965,7 @@
     <w:link w:val="Heading7"/>
     <w:uiPriority w:val="9"/>
     <w:semiHidden/>
-    <w:rsid w:val="00FA0656"/>
+    <w:rsid w:val="009E6A7F"/>
     <w:rPr>
       <w:rFonts w:eastAsiaTheme="majorEastAsia" w:cstheme="majorBidi"/>
       <w:color w:val="595959" w:themeColor="text1" w:themeTint="A6"/>
@@ -944,7 +977,7 @@
     <w:link w:val="Heading8"/>
     <w:uiPriority w:val="9"/>
     <w:semiHidden/>
-    <w:rsid w:val="00FA0656"/>
+    <w:rsid w:val="009E6A7F"/>
     <w:rPr>
       <w:rFonts w:eastAsiaTheme="majorEastAsia" w:cstheme="majorBidi"/>
       <w:i/>
@@ -958,7 +991,7 @@
     <w:link w:val="Heading9"/>
     <w:uiPriority w:val="9"/>
     <w:semiHidden/>
-    <w:rsid w:val="00FA0656"/>
+    <w:rsid w:val="009E6A7F"/>
     <w:rPr>
       <w:rFonts w:eastAsiaTheme="majorEastAsia" w:cstheme="majorBidi"/>
       <w:color w:val="272727" w:themeColor="text1" w:themeTint="D8"/>
@@ -971,7 +1004,7 @@
     <w:link w:val="TitleChar"/>
     <w:uiPriority w:val="10"/>
     <w:qFormat/>
-    <w:rsid w:val="00FA0656"/>
+    <w:rsid w:val="009E6A7F"/>
     <w:pPr>
       <w:spacing w:after="80" w:line="240" w:lineRule="auto"/>
       <w:contextualSpacing/>
@@ -989,7 +1022,7 @@
     <w:basedOn w:val="DefaultParagraphFont"/>
     <w:link w:val="Title"/>
     <w:uiPriority w:val="10"/>
-    <w:rsid w:val="00FA0656"/>
+    <w:rsid w:val="009E6A7F"/>
     <w:rPr>
       <w:rFonts w:asciiTheme="majorHAnsi" w:eastAsiaTheme="majorEastAsia" w:hAnsiTheme="majorHAnsi" w:cstheme="majorBidi"/>
       <w:spacing w:val="-10"/>
@@ -1005,7 +1038,7 @@
     <w:link w:val="SubtitleChar"/>
     <w:uiPriority w:val="11"/>
     <w:qFormat/>
-    <w:rsid w:val="00FA0656"/>
+    <w:rsid w:val="009E6A7F"/>
     <w:pPr>
       <w:numPr>
         <w:ilvl w:val="1"/>
@@ -1024,7 +1057,7 @@
     <w:basedOn w:val="DefaultParagraphFont"/>
     <w:link w:val="Subtitle"/>
     <w:uiPriority w:val="11"/>
-    <w:rsid w:val="00FA0656"/>
+    <w:rsid w:val="009E6A7F"/>
     <w:rPr>
       <w:rFonts w:eastAsiaTheme="majorEastAsia" w:cstheme="majorBidi"/>
       <w:color w:val="595959" w:themeColor="text1" w:themeTint="A6"/>
@@ -1040,7 +1073,7 @@
     <w:link w:val="QuoteChar"/>
     <w:uiPriority w:val="29"/>
     <w:qFormat/>
-    <w:rsid w:val="00FA0656"/>
+    <w:rsid w:val="009E6A7F"/>
     <w:pPr>
       <w:spacing w:before="160"/>
       <w:jc w:val="center"/>
@@ -1056,7 +1089,7 @@
     <w:basedOn w:val="DefaultParagraphFont"/>
     <w:link w:val="Quote"/>
     <w:uiPriority w:val="29"/>
-    <w:rsid w:val="00FA0656"/>
+    <w:rsid w:val="009E6A7F"/>
     <w:rPr>
       <w:i/>
       <w:iCs/>
@@ -1068,7 +1101,7 @@
     <w:basedOn w:val="Normal"/>
     <w:uiPriority w:val="34"/>
     <w:qFormat/>
-    <w:rsid w:val="00FA0656"/>
+    <w:rsid w:val="009E6A7F"/>
     <w:pPr>
       <w:ind w:left="720"/>
       <w:contextualSpacing/>
@@ -1079,7 +1112,7 @@
     <w:basedOn w:val="DefaultParagraphFont"/>
     <w:uiPriority w:val="21"/>
     <w:qFormat/>
-    <w:rsid w:val="00FA0656"/>
+    <w:rsid w:val="009E6A7F"/>
     <w:rPr>
       <w:i/>
       <w:iCs/>
@@ -1093,7 +1126,7 @@
     <w:link w:val="IntenseQuoteChar"/>
     <w:uiPriority w:val="30"/>
     <w:qFormat/>
-    <w:rsid w:val="00FA0656"/>
+    <w:rsid w:val="009E6A7F"/>
     <w:pPr>
       <w:pBdr>
         <w:top w:val="single" w:sz="4" w:space="10" w:color="0F4761" w:themeColor="accent1" w:themeShade="BF"/>
@@ -1114,7 +1147,7 @@
     <w:basedOn w:val="DefaultParagraphFont"/>
     <w:link w:val="IntenseQuote"/>
     <w:uiPriority w:val="30"/>
-    <w:rsid w:val="00FA0656"/>
+    <w:rsid w:val="009E6A7F"/>
     <w:rPr>
       <w:i/>
       <w:iCs/>
@@ -1126,7 +1159,7 @@
     <w:basedOn w:val="DefaultParagraphFont"/>
     <w:uiPriority w:val="32"/>
     <w:qFormat/>
-    <w:rsid w:val="00FA0656"/>
+    <w:rsid w:val="009E6A7F"/>
     <w:rPr>
       <w:b/>
       <w:bCs/>
@@ -1140,7 +1173,7 @@
     <w:basedOn w:val="DefaultParagraphFont"/>
     <w:uiPriority w:val="99"/>
     <w:semiHidden/>
-    <w:rsid w:val="00FA0656"/>
+    <w:rsid w:val="009E6A7F"/>
     <w:rPr>
       <w:color w:val="666666"/>
     </w:rPr>
@@ -1164,7 +1197,7 @@
         <w:behaviors>
           <w:behavior w:val="content"/>
         </w:behaviors>
-        <w:guid w:val="{9F04ACD9-BBFE-4019-A357-60DD5FA10384}"/>
+        <w:guid w:val="{F74AFA04-DEDF-4F96-93A7-86B2AF40EC65}"/>
       </w:docPartPr>
       <w:docPartBody>
         <w:p>
@@ -1227,10 +1260,10 @@
     <w:compatSetting w:name="useWord2013TrackBottomHyphenation" w:uri="http://schemas.microsoft.com/office/word" w:val="0"/>
   </w:compat>
   <w:rsids>
-    <w:rsidRoot w:val="00A50FEB"/>
-    <w:rsid w:val="00593006"/>
-    <w:rsid w:val="007A0617"/>
-    <w:rsid w:val="00A50FEB"/>
+    <w:rsidRoot w:val="00461BB1"/>
+    <w:rsid w:val="003E5910"/>
+    <w:rsid w:val="00461BB1"/>
+    <w:rsid w:val="006F11E1"/>
   </w:rsids>
   <m:mathPr>
     <m:mathFont m:val="Cambria Math"/>
@@ -1686,7 +1719,7 @@
     <w:basedOn w:val="DefaultParagraphFont"/>
     <w:uiPriority w:val="99"/>
     <w:semiHidden/>
-    <w:rsid w:val="00A50FEB"/>
+    <w:rsid w:val="00461BB1"/>
     <w:rPr>
       <w:color w:val="666666"/>
     </w:rPr>

</xml_diff>